<commit_message>
Expand both disability & risk reflections (Miriam, Hadir)
Co-Authored-By: Claude <noreply@anthropic.com>
</commit_message>
<xml_diff>
--- a/מוגבלות_וסיכון_רפלקציה_הדיר.docx
+++ b/מוגבלות_וסיכון_רפלקציה_הדיר.docx
@@ -217,7 +217,7 @@
           <w:szCs w:val="24"/>
           <w:rtl w:val="1"/>
         </w:rPr>
-        <w:t>אם אצטרך לומר במשפט אחד מה הקורס הזה עשה לי, זה שהוא לימד אותי להסתכל על סיכון דרך משקפיים מגדריים. עד הקורס חשבתי על מוגבלות כמצב אחד, בלי הבדל בין גבר לאישה. השיעור על פגיעוּת מגדרית שינה לי את זה. הנתונים שקרן הציגה נשארו איתי, שאחת מכל שלוש נשים בעולם חווה אלימות פיזית או מינית במהלך חייה, ושכאשר מוסיפים מוגבלות הסיכון כמעט מוכפל. פתאום הבנתי שאישה עם מוגבלות עומדת בהצטלבות של שני מקורות של פגיעוּת, ולא רק של אחד.</w:t>
+        <w:t>אם אצטרך לומר במשפט אחד מה הקורס הזה עשה לי, זה שהוא לימד אותי להסתכל על סיכון דרך משקפיים מגדריים. עד הקורס חשבתי על מוגבלות כמצב אחד, בלי הבדל בין גבר לאישה. השיעור על פגיעוּת מגדרית שינה לי את זה. הנתונים שקרן הציגה נשארו איתי, שאחת מכל שלוש נשים בעולם חווה אלימות פיזית או מינית במהלך חייה, ושכאשר מוסיפים מוגבלות הסיכון כמעט מוכפל. פתאום הבנתי שאישה עם מוגבלות עומדת בהצטלבות של שני מקורות של פגיעוּת, ולא רק של אחד. הצירוף הזה, של מגדר ומוגבלות יחד, הפך למשקפיים שדרכם אני מסתכלת עכשיו על כל מקרה.</w:t>
       </w:r>
     </w:p>
     <w:p>
@@ -235,7 +235,7 @@
           <w:szCs w:val="24"/>
           <w:rtl w:val="1"/>
         </w:rPr>
-        <w:t>מה שחידש לי במיוחד היה להבין למה זה קורה. זה לא בגלל האישה עצמה, אלא בגלל מבנה של תלות. מי שאמור לתמוך הוא לפעמים גם מי שפוגע, והפחד לאבד את התמיכה, יחד עם בידוד חברתי וחוסר ידע על גבולות ועל זכויות, סוגר על האישה את הדרך לספר. הצירוף הזה יצר בעיניי את מה שקרן כינתה הקורבן ה"שקוף", זאת שהמערכת מתקשה לראות ולכן גם מתקשה להגן עליה.</w:t>
+        <w:t>מה שחידש לי במיוחד היה להבין למה זה קורה. זה לא בגלל האישה עצמה, אלא בגלל מבנה של תלות. מי שאמור לתמוך הוא לפעמים גם מי שפוגע, והפחד לאבד את התמיכה, יחד עם בידוד חברתי וחוסר ידע על גבולות ועל זכויות, סוגר על האישה את הדרך לספר. הצירוף הזה יצר בעיניי את מה שקרן כינתה הקורבן ה"שקוף", זאת שהמערכת מתקשה לראות ולכן גם מתקשה להגן עליה. הבנתי שהשקיפות הזאת איננה מקרה, היא תוצאה של סטיגמות שמראש לא מאמינות לאישה עם מוגבלות, ושל עדויות שנוטים לצמצם ולפקפק בהן.</w:t>
       </w:r>
     </w:p>
     <w:p>
@@ -253,7 +253,7 @@
           <w:szCs w:val="24"/>
           <w:rtl w:val="1"/>
         </w:rPr>
-        <w:t>כשעבדנו עם מרים על המצגת "זה הילד שלי" ועל פרשת מעון בני ציון, ראיתי את הרעיון הזה מתגלם. הפגיעה לא צעקה החוצה, היא התרחשה בשקט בתוך מסגרת סגורה, מול אנשים שלא היו להם הכלים או הכוח להישמע. חשבתי הרבה על הנשים הדיירות שם, ועל כמה קל היה להתעלם מהן דווקא משום שהיו תלויות לגמרי במי שהיה אמור לשמור עליהן.</w:t>
+        <w:t>נקודה נוספת שנחרתה בי היא שנערות עם מוגבלות נמצאות בסיכון גבוה עוד יותר. הרצון החזק להשתייך, פערי הכוח מול בני גילן, וחוסר הידע על גבולות ועל זכויות, יוצרים שילוב מסוכן דווקא בגיל שבו כל נערה מחפשת קרבה והכרה. חשבתי כמה פעמים אנחנו ממהרים להגן על נערה כזאת דרך צמצום, אוסרים ומגבילים, במקום לתת לה את הידע שיאפשר לה לשמור על עצמה. שם, בפער הזה, הקורס באמת פגש אותי.</w:t>
       </w:r>
     </w:p>
     <w:p>
@@ -271,7 +271,25 @@
           <w:szCs w:val="24"/>
           <w:rtl w:val="1"/>
         </w:rPr>
-        <w:t>הקורס פגש אותי גם בבעיה שנראתה לי טכנית והתבררה כמהותית, המחסור בנתונים. נשים וצעירות עם מוגבלות כמעט לא מיוצגות במחקרים, וקשה לבנות מדיניות למי שכמעט לא נספרת. אני יוצאת מהקורס עם החלטה פשוטה, לשים לב דווקא למי שקל לפספס, ולזכור שהשתיקה של אישה עם מוגבלות היא לרוב סימן לפער כוחות, לא לכך שהכול בסדר.</w:t>
+        <w:t>כשעבדנו עם מרים על המצגת "זה הילד שלי" ועל פרשת מעון בני ציון, ראיתי את הרעיון הזה מתגלם. הפגיעה לא צעקה החוצה, היא התרחשה בשקט בתוך מסגרת סגורה, מול אנשים שלא היו להם הכלים או הכוח להישמע. חשבתי הרבה על הנשים הדיירות שם, ועל כמה קל היה להתעלם מהן דווקא משום שהיו תלויות לגמרי במי שהיה אמור לשמור עליהן. המצגת לקחה עבורי את התאוריה מהשקפים והפכה אותה לסיפור של בני אדם.</w:t>
+      </w:r>
+    </w:p>
+    <w:p>
+      <w:pPr>
+        <w:bidi w:val="1"/>
+        <w:spacing w:line="360" w:lineRule="auto" w:after="160"/>
+        <w:jc w:val="both"/>
+      </w:pPr>
+      <w:r>
+        <w:rPr>
+          <w:rFonts w:ascii="David" w:hAnsi="David" w:cs="David"/>
+          <w:b w:val="0"/>
+          <w:i w:val="0"/>
+          <w:sz w:val="24"/>
+          <w:szCs w:val="24"/>
+          <w:rtl w:val="1"/>
+        </w:rPr>
+        <w:t>הקורס פגש אותי גם בבעיה שנראתה לי טכנית והתבררה כמהותית, המחסור בנתונים. נשים וצעירות עם מוגבלות כמעט לא מיוצגות במחקרים, וקשה לבנות מדיניות למי שכמעט לא נספרת. קרן קראה לזה כדור שלג, המחסור בנתונים מוביל למדיניות לא מותאמת, וזו מחזירה את הנשים אל אותה שקיפות שבה התחלנו. אני יוצאת מהקורס עם החלטה פשוטה, לשים לב דווקא למי שקל לפספס, ולזכור שהשתיקה של אישה עם מוגבלות היא לרוב סימן לפער כוחות, לא לכך שהכול בסדר.</w:t>
       </w:r>
     </w:p>
     <w:p>
@@ -330,7 +348,7 @@
           <w:szCs w:val="24"/>
           <w:rtl w:val="1"/>
         </w:rPr>
-        <w:t>בחרתי להעמיק במפגש שבין מגדר לבין מוגבלות, משום שזה החלק שהכי הפתיע אותי בקורס. הבסיס העובדתי מוצק. סקירה שיטתית ומטא-אנליזה רחבה מצאו שמבוגרים עם מוגבלות נמצאים בסיכון גבוה משמעותית לאלימות בהשוואה למבוגרים ללא מוגבלות, ושבתוך הקבוצה הזו נשים חשופות במיוחד לאלימות מינית וזוגית (Hughes et al., 2012). כלומר לא מדובר בתחושה אלא בתופעה מתועדת שחוזרת על עצמה במחקרים ובמדינות שונות.</w:t>
+        <w:t>בחרתי להעמיק במפגש שבין מגדר לבין מוגבלות, משום שזה החלק שהכי הפתיע אותי בקורס. הרעיון המרכזי הוא שאין כאן שני גורמי סיכון שמתחברים בפשטות, אלא הצטלבות שיוצרת פגיעוּת מסוג חדש. אישה עם מוגבלות חשופה גם לאלימות שמופנית כלפי נשים באשר הן, וגם לאלימות שמכוונת אל המוגבלות שלה, ולעיתים קרובות שתי הצורות שזורות זו בזו עד שאי אפשר להפריד ביניהן. זו נקודת המוצא שממנה יצאתי אל המקורות.</w:t>
       </w:r>
     </w:p>
     <w:p>
@@ -348,7 +366,7 @@
           <w:szCs w:val="24"/>
           <w:rtl w:val="1"/>
         </w:rPr>
-        <w:t>סקירת ספרות שהתמקדה דווקא בנשים עם מוגבלות מוסיפה על כך שכבה חשובה. היא מראה שנשים עם מוגבלות חוות לא רק את צורות האלימות המוכרות, אלא גם פגיעות שמכוונות ישירות למוגבלות שלהן, כמו מניעת עזרים, שליטה בתרופות או ניצול התלות הפיזית. הכותבות מדגישות שהתלות במטפל, לצד חסמים בתקשורת ובנגישות, מקשה על הנשים לחשוף את הפגיעה ולקבל מענה (Plummer &amp; Findley, 2012). זהו בדיוק אותו מנגנון של תלות שקרן תיארה בשיעור, כאן הוא מקבל ביסוס מחקרי.</w:t>
+        <w:t>הבסיס העובדתי מוצק. סקירה שיטתית ומטא-אנליזה רחבה מצאו שמבוגרים עם מוגבלות נמצאים בסיכון גבוה משמעותית לאלימות בהשוואה למבוגרים ללא מוגבלות, ושבתוך הקבוצה הזו הפגיעוּת גבוהה במיוחד כשמדובר באלימות מינית וזוגית (Hughes et al., 2012). כלומר לא מדובר בתחושה אלא בתופעה מתועדת שחוזרת על עצמה במחקרים ובמדינות שונות. הנתון הזה נותן משקל למה שקרן הציגה בשיעור, ומונע ממנו להישאר ברמת האנקדוטה.</w:t>
       </w:r>
     </w:p>
     <w:p>
@@ -366,7 +384,7 @@
           <w:szCs w:val="24"/>
           <w:rtl w:val="1"/>
         </w:rPr>
-        <w:t>אם אלה מקורות הסיכון, מהו כיוון המענה. כאן עזר לי מחקר שבחן הגדרה עצמית ואוטונומיה בקבלת החלטות בקרב מתבגרים עם מוגבלות. הוא מצא שההגדרה העצמית איננה תכונה מולדת אלא יכולת שנבנית או נחסמת בהתאם לסביבה, ושדווקא מתוך רצון להגן נוטים המבוגרים לצמצם את מרחב הבחירה של הנער או הנערה, ובכך מעכבים את היכולת שהם מבקשים לחזק (טאוב, 2018). עבור נערות עם מוגבלות המשמעות כפולה, משום שידע על גבולות, על מיניות ועל זכויות הוא בעצמו גורם מגן מפני פגיעה.</w:t>
+        <w:t>סקירת ספרות שהתמקדה דווקא בנשים עם מוגבלות מוסיפה על כך שכבה חשובה. היא מראה שנשים עם מוגבלות חוות לא רק את צורות האלימות המוכרות, אלא גם פגיעות שמכוונות ישירות למוגבלות שלהן, כמו מניעת עזרים, שליטה בתרופות או ניצול התלות הפיזית. הכותבות מדגישות שהתלות במטפל, לצד חסמים בתקשורת ובנגישות, מקשה על הנשים לחשוף את הפגיעה ולקבל מענה, ולכן הפגיעה נמשכת לעיתים זמן רב (Plummer &amp; Findley, 2012). זהו בדיוק אותו מנגנון של תלות שקרן תיארה בשיעור, וכאן הוא מקבל ביסוס מחקרי מסודר.</w:t>
       </w:r>
     </w:p>
     <w:p>
@@ -384,7 +402,43 @@
           <w:szCs w:val="24"/>
           <w:rtl w:val="1"/>
         </w:rPr>
-        <w:t>המסקנה שאני לוקחת היא שהגנה על נשים ונערות עם מוגבלות לא יכולה להסתכם בשמירה מבחוץ. שמירה לבדה משאירה אותן תלויות, ולעיתים תלויות דווקא במי שעלול לפגוע. מה שהקורס קרא לו שינוי פרדיגמה ליישום רגיש מגדר מקבל כאן תוכן ממשי, לחזק את הקול, את הידע ואת מעגלי התמיכה של האישה עצמה, כך שהיא לא רק מוגנת אלא גם מסוגלת להגן על עצמה. זו בעיניי החוליה שחסרה כשמדברים רק על מוגנות.</w:t>
+        <w:t>המנגנון הזה מסביר גם למה כל כך קשה להגיע אל הפגיעות האלה. כשהפוגע הוא גם מקור התמיכה, כל תלונה מאיימת על עצם הקיום היומיומי של האישה, מי יעזור לה לקום בבוקר, מי ילווה אותה, מי יישאר. לזה מתווספים בידוד חברתי, פחות רשתות תמיכה, ופחות חשיפה לידע על זכויות ועל מיניות. התוצאה היא שתיקה שקל לפרש בטעות כהיעדר בעיה, בעוד שהיא בעצם ביטוי מובהק של פער כוחות.</w:t>
+      </w:r>
+    </w:p>
+    <w:p>
+      <w:pPr>
+        <w:bidi w:val="1"/>
+        <w:spacing w:line="360" w:lineRule="auto" w:after="160"/>
+        <w:jc w:val="both"/>
+      </w:pPr>
+      <w:r>
+        <w:rPr>
+          <w:rFonts w:ascii="David" w:hAnsi="David" w:cs="David"/>
+          <w:b w:val="0"/>
+          <w:i w:val="0"/>
+          <w:sz w:val="24"/>
+          <w:szCs w:val="24"/>
+          <w:rtl w:val="1"/>
+        </w:rPr>
+        <w:t>אם אלה מקורות הסיכון, מהו כיוון המענה. כאן עזר לי מחקר שבחן הגדרה עצמית ואוטונומיה בקבלת החלטות בקרב מתבגרים עם מוגבלות. הוא מצא שההגדרה העצמית איננה תכונה מולדת אלא יכולת שנבנית או נחסמת בהתאם לסביבה, ושדווקא מתוך רצון להגן נוטים המבוגרים לצמצם את מרחב הבחירה של הנער או הנערה, ובכך מעכבים את היכולת שהם מבקשים לחזק (טאוב, 2018). עבור נערות עם מוגבלות המשמעות כפולה, משום שידע על גבולות, על מיניות ועל זכויות הוא בעצמו גורם מגן מפני פגיעה. נערה שיודעת מה מותר ומה אסור, ושמאמינים לה כשהיא מספרת, קשה הרבה יותר לפגוע בה.</w:t>
+      </w:r>
+    </w:p>
+    <w:p>
+      <w:pPr>
+        <w:bidi w:val="1"/>
+        <w:spacing w:line="360" w:lineRule="auto" w:after="160"/>
+        <w:jc w:val="both"/>
+      </w:pPr>
+      <w:r>
+        <w:rPr>
+          <w:rFonts w:ascii="David" w:hAnsi="David" w:cs="David"/>
+          <w:b w:val="0"/>
+          <w:i w:val="0"/>
+          <w:sz w:val="24"/>
+          <w:szCs w:val="24"/>
+          <w:rtl w:val="1"/>
+        </w:rPr>
+        <w:t>המסקנה שאני לוקחת היא שהגנה על נשים ונערות עם מוגבלות לא יכולה להסתכם בשמירה מבחוץ. שמירה לבדה משאירה אותן תלויות, ולעיתים תלויות דווקא במי שעלול לפגוע. מה שהקורס קרא לו שינוי פרדיגמה ליישום רגיש מגדר מקבל כאן תוכן ממשי, לחזק את הקול, את הידע ואת מעגלי התמיכה של האישה עצמה, כך שהיא לא רק מוגנת אלא גם מסוגלת להגן על עצמה. זו בעיניי החוליה שחסרה כשמדברים רק על מוגנות, והיא גם החוליה שהופכת את ההגנה למכבדת ולא למשתיקה.</w:t>
       </w:r>
     </w:p>
     <w:p>

</xml_diff>

<commit_message>
Ground topic section (part bet) more explicitly in course content
Co-Authored-By: Claude <noreply@anthropic.com>
</commit_message>
<xml_diff>
--- a/מוגבלות_וסיכון_רפלקציה_הדיר.docx
+++ b/מוגבלות_וסיכון_רפלקציה_הדיר.docx
@@ -349,6 +349,24 @@
           <w:rtl w:val="1"/>
         </w:rPr>
         <w:t>בחרתי להעמיק במפגש שבין מגדר לבין מוגבלות, משום שזה החלק שהכי הפתיע אותי בקורס. הרעיון המרכזי הוא שאין כאן שני גורמי סיכון שמתחברים בפשטות, אלא הצטלבות שיוצרת פגיעוּת מסוג חדש. אישה עם מוגבלות חשופה גם לאלימות שמופנית כלפי נשים באשר הן, וגם לאלימות שמכוונת אל המוגבלות שלה, ולעיתים קרובות שתי הצורות שזורות זו בזו עד שאי אפשר להפריד ביניהן. זו נקודת המוצא שממנה יצאתי אל המקורות.</w:t>
+      </w:r>
+    </w:p>
+    <w:p>
+      <w:pPr>
+        <w:bidi w:val="1"/>
+        <w:spacing w:line="360" w:lineRule="auto" w:after="160"/>
+        <w:jc w:val="both"/>
+      </w:pPr>
+      <w:r>
+        <w:rPr>
+          <w:rFonts w:ascii="David" w:hAnsi="David" w:cs="David"/>
+          <w:b w:val="0"/>
+          <w:i w:val="0"/>
+          <w:sz w:val="24"/>
+          <w:szCs w:val="24"/>
+          <w:rtl w:val="1"/>
+        </w:rPr>
+        <w:t>הבחירה בנושא נשענת על השיעור שקרן הקדישה לפגיעוּת מגדרית. שם למדנו שנשים עם מוגבלות חשופות כמעט פי שניים לאלימות בהשוואה לנשים ללא מוגבלות, ושהמנגנון המרכזי שמעצים את הסיכון הוא תלות, כשמי שאמור לתמוך הוא לעיתים גם הפוגע. קרן הצביעה על שורה של גורמים שמעמיקים את הפגיעוּת, בהם בידוד חברתי, פחד לאבד תמיכה, מיעוט רשתות תמיכה, חוסר ידע על גבולות ועל זכויות, וסטיגמות שמראש מפקפקות בעדות של אישה עם מוגבלות. קרן גם הצביעה על נערות עם מוגבלות כקבוצה בסיכון גבוה עוד יותר, ועל בעיית המחסור בנתונים שמקשה לבנות מדיניות מותאמת. על הבסיס הזה, שנלמד בכיתה, אני מבקשת להעמיק בעזרת מחקרים שאינם בסילבוס.</w:t>
       </w:r>
     </w:p>
     <w:p>

</xml_diff>

<commit_message>
Replace Taub (2018) report in Hadir's work with peer-reviewed open-access Sutherland et al. (2024)
Co-Authored-By: Claude <noreply@anthropic.com>
</commit_message>
<xml_diff>
--- a/מוגבלות_וסיכון_רפלקציה_הדיר.docx
+++ b/מוגבלות_וסיכון_רפלקציה_הדיר.docx
@@ -438,7 +438,7 @@
           <w:szCs w:val="24"/>
           <w:rtl w:val="1"/>
         </w:rPr>
-        <w:t>אם אלה מקורות הסיכון, מהו כיוון המענה. כאן עזר לי מחקר שבחן הגדרה עצמית ואוטונומיה בקבלת החלטות בקרב מתבגרים עם מוגבלות. הוא מצא שההגדרה העצמית איננה תכונה מולדת אלא יכולת שנבנית או נחסמת בהתאם לסביבה, ושדווקא מתוך רצון להגן נוטים המבוגרים לצמצם את מרחב הבחירה של הנער או הנערה, ובכך מעכבים את היכולת שהם מבקשים לחזק (טאוב, 2018). עבור נערות עם מוגבלות המשמעות כפולה, משום שידע על גבולות, על מיניות ועל זכויות הוא בעצמו גורם מגן מפני פגיעה. נערה שיודעת מה מותר ומה אסור, ושמאמינים לה כשהיא מספרת, קשה הרבה יותר לפגוע בה.</w:t>
+        <w:t>אם אלה מקורות הסיכון, מהו כיוון המענה. סקירה שיטתית עדכנית שבחנה התערבויות למניעה ראשונית של אלימות כלפי נשים עם מוגבלות מצאה שהתחום עדיין דל ולא מפותח, ושרוב ההתערבויות הקיימות אינן מתמודדות עם השורשים של האלימות, כלומר עם ההצטלבות שבין תפיסות מפלות על רקע מוגבלות לבין תפיסות מגדריות. הכותבות מדגישות שהיעדר מבט מצטלב הוא כשל מרכזי, ושמניעה אמיתית מחייבת לפעול במעלה הזרם, על העמדות ועל יחסי הכוח, ולא רק להגיב אחרי שהפגיעה כבר קרתה (Sutherland et al., 2024). עבור נערות ונשים עם מוגבלות המשמעות היא שחיזוק הידע על גבולות, על מיניות ועל זכויות, לצד שינוי היחס החברתי אליהן, הוא בעצמו גורם מגן ולא מותרות. אישה שיודעת מה מותר ומה אסור, ושמאמינים לה כשהיא מספרת, קשה הרבה יותר לפגוע בה.</w:t>
       </w:r>
     </w:p>
     <w:p>
@@ -498,71 +498,6 @@
           <w:szCs w:val="24"/>
           <w:rtl w:val="1"/>
         </w:rPr>
-        <w:t xml:space="preserve">טאוב, ת' (2018). </w:t>
-      </w:r>
-      <w:r>
-        <w:rPr>
-          <w:rFonts w:ascii="David" w:hAnsi="David" w:cs="David"/>
-          <w:b w:val="0"/>
-          <w:i/>
-          <w:sz w:val="24"/>
-          <w:szCs w:val="24"/>
-          <w:rtl w:val="1"/>
-        </w:rPr>
-        <w:t>הגדרה עצמית ואוטונומיה בקבלת החלטות של מתבגרים עם מוגבלות</w:t>
-      </w:r>
-      <w:r>
-        <w:rPr>
-          <w:rFonts w:ascii="David" w:hAnsi="David" w:cs="David"/>
-          <w:b w:val="0"/>
-          <w:i w:val="0"/>
-          <w:sz w:val="24"/>
-          <w:szCs w:val="24"/>
-          <w:rtl w:val="1"/>
-        </w:rPr>
-        <w:t>. ירושלים: קרן שלם.</w:t>
-      </w:r>
-      <w:r>
-        <w:rPr>
-          <w:rFonts w:ascii="David" w:hAnsi="David" w:cs="David"/>
-          <w:b w:val="0"/>
-          <w:i w:val="0"/>
-          <w:sz w:val="24"/>
-          <w:szCs w:val="24"/>
-          <w:rtl w:val="1"/>
-        </w:rPr>
-        <w:t xml:space="preserve"> </w:t>
-      </w:r>
-      <w:hyperlink r:id="rId9">
-        <w:r>
-          <w:rPr>
-            <w:rFonts w:ascii="David" w:hAnsi="David" w:cs="David"/>
-            <w:sz w:val="24"/>
-            <w:szCs w:val="24"/>
-            <w:color w:val="0563C1"/>
-            <w:u w:val="single"/>
-            <w:rtl w:val="1"/>
-          </w:rPr>
-          <w:t xml:space="preserve">https://www.kshalem.org.il/wp-content/uploads/2023/05/%D7%94%D7%9E%D7%97%D7%A7%D7%A8-%D7%94%D7%9E%D7%9C%D7%90-890-109-2018.pdf</w:t>
-        </w:r>
-      </w:hyperlink>
-    </w:p>
-    <w:p>
-      <w:pPr>
-        <w:bidi w:val="1"/>
-        <w:spacing w:line="360" w:lineRule="auto" w:after="200"/>
-        <w:ind w:left="720" w:hanging="720"/>
-        <w:jc w:val="both"/>
-      </w:pPr>
-      <w:r>
-        <w:rPr>
-          <w:rFonts w:ascii="David" w:hAnsi="David" w:cs="David"/>
-          <w:b w:val="0"/>
-          <w:i w:val="0"/>
-          <w:sz w:val="24"/>
-          <w:szCs w:val="24"/>
-          <w:rtl w:val="1"/>
-        </w:rPr>
         <w:t xml:space="preserve">Hughes, K., Bellis, M. A., Jones, L., Wood, S., Bates, G., Eckley, L., … Officer, A. (2012). Prevalence and risk of violence against adults with disabilities: A systematic review and meta-analysis of observational studies. </w:t>
       </w:r>
       <w:r>
@@ -598,7 +533,7 @@
         </w:rPr>
         <w:t xml:space="preserve"> </w:t>
       </w:r>
-      <w:hyperlink r:id="rId10">
+      <w:hyperlink r:id="rId9">
         <w:r>
           <w:rPr>
             <w:rFonts w:ascii="David" w:hAnsi="David" w:cs="David"/>
@@ -663,6 +598,71 @@
         </w:rPr>
         <w:t xml:space="preserve"> </w:t>
       </w:r>
+      <w:hyperlink r:id="rId10">
+        <w:r>
+          <w:rPr>
+            <w:rFonts w:ascii="David" w:hAnsi="David" w:cs="David"/>
+            <w:sz w:val="24"/>
+            <w:szCs w:val="24"/>
+            <w:color w:val="0563C1"/>
+            <w:u w:val="single"/>
+            <w:rtl w:val="1"/>
+          </w:rPr>
+          <w:t xml:space="preserve">https://doi.org/10.1177/1524838011426014</w:t>
+        </w:r>
+      </w:hyperlink>
+    </w:p>
+    <w:p>
+      <w:pPr>
+        <w:bidi w:val="1"/>
+        <w:spacing w:line="360" w:lineRule="auto" w:after="200"/>
+        <w:ind w:left="720" w:hanging="720"/>
+        <w:jc w:val="both"/>
+      </w:pPr>
+      <w:r>
+        <w:rPr>
+          <w:rFonts w:ascii="David" w:hAnsi="David" w:cs="David"/>
+          <w:b w:val="0"/>
+          <w:i w:val="0"/>
+          <w:sz w:val="24"/>
+          <w:szCs w:val="24"/>
+          <w:rtl w:val="1"/>
+        </w:rPr>
+        <w:t xml:space="preserve">Sutherland, G., Hargrave, J., Krnjacki, L., Llewellyn, G., Kavanagh, A., &amp; Vaughan, C. (2024). A systematic review of interventions addressing the primary prevention of violence against women with disability. </w:t>
+      </w:r>
+      <w:r>
+        <w:rPr>
+          <w:rFonts w:ascii="David" w:hAnsi="David" w:cs="David"/>
+          <w:b w:val="0"/>
+          <w:i/>
+          <w:sz w:val="24"/>
+          <w:szCs w:val="24"/>
+          <w:rtl w:val="1"/>
+        </w:rPr>
+        <w:t>Trauma, Violence, &amp; Abuse, 25</w:t>
+      </w:r>
+      <w:r>
+        <w:rPr>
+          <w:rFonts w:ascii="David" w:hAnsi="David" w:cs="David"/>
+          <w:b w:val="0"/>
+          <w:i w:val="0"/>
+          <w:sz w:val="24"/>
+          <w:szCs w:val="24"/>
+          <w:rtl w:val="1"/>
+        </w:rPr>
+        <w:t>(2), 1235-1247.</w:t>
+      </w:r>
+      <w:r>
+        <w:rPr>
+          <w:rFonts w:ascii="David" w:hAnsi="David" w:cs="David"/>
+          <w:b w:val="0"/>
+          <w:i w:val="0"/>
+          <w:sz w:val="24"/>
+          <w:szCs w:val="24"/>
+          <w:rtl w:val="1"/>
+        </w:rPr>
+        <w:t xml:space="preserve"> </w:t>
+      </w:r>
       <w:hyperlink r:id="rId11">
         <w:r>
           <w:rPr>
@@ -673,7 +673,7 @@
             <w:u w:val="single"/>
             <w:rtl w:val="1"/>
           </w:rPr>
-          <w:t xml:space="preserve">https://doi.org/10.1177/1524838011426014</w:t>
+          <w:t xml:space="preserve">https://doi.org/10.1177/15248380231175932</w:t>
         </w:r>
       </w:hyperlink>
     </w:p>

</xml_diff>

<commit_message>
Add two new Hebrew peer-reviewed open-access sources to Hadir's work (Holler-Werner 2025; Rodriguez Barnea 2025)
Co-Authored-By: Claude <noreply@anthropic.com>
</commit_message>
<xml_diff>
--- a/מוגבלות_וסיכון_רפלקציה_הדיר.docx
+++ b/מוגבלות_וסיכון_רפלקציה_הדיר.docx
@@ -456,6 +456,42 @@
           <w:szCs w:val="24"/>
           <w:rtl w:val="1"/>
         </w:rPr>
+        <w:t>המענה הזה מקבל ביטוי מוסדי גם בישראל. מחקר עדכני שבחן את יישום תיקון 18 לחוק הכשרות המשפטית מצא שלמרות הכוונה לצמצם את השימוש באפוטרופסות ולקדם קבלת החלטות נתמכת, נותר פער בין חזון הרפורמה לבין הפרקטיקה, ושעובדות סוציאליות עדיין נשענות על תפיסות של אבחון, רמת תפקוד ורצון בבואן להמליץ. עבור נשים עם מוגבלות למהלך הזה משמעות ישירה, משום שצמצום התלות המשפטית והחזרת הקול לאישה עצמה הם בדיוק מה שמפרק את מבנה הכוח שאיפשר את הפגיעה מלכתחילה (הולר וורנר, 2025).</w:t>
+      </w:r>
+    </w:p>
+    <w:p>
+      <w:pPr>
+        <w:bidi w:val="1"/>
+        <w:spacing w:line="360" w:lineRule="auto" w:after="160"/>
+        <w:jc w:val="both"/>
+      </w:pPr>
+      <w:r>
+        <w:rPr>
+          <w:rFonts w:ascii="David" w:hAnsi="David" w:cs="David"/>
+          <w:b w:val="0"/>
+          <w:i w:val="0"/>
+          <w:sz w:val="24"/>
+          <w:szCs w:val="24"/>
+          <w:rtl w:val="1"/>
+        </w:rPr>
+        <w:t>נדבך אחרון נוגע ליכולת שלנו לשמוע. גם השתיקה של אישה עם מוגבלות, או התנהגות שנתפסת כ"בעייתית", היא לעיתים האופן היחיד שבו היא מסמנת שמשהו אינו כשורה. מחקר עדכני שעסק בהתנהגויות מאתגרות בקרב ילדים עם אוטיזם הראה שהתנהגות היא לא פעם "קול", דרך תקשורת שמאותתת על מצוקה או על כאב שאין לו ביטוי מילולי, ולכן היא מזמינה פענוח ולא השתקה. העיקרון הזה חורג מעבר לאוטיזם, ותקף לכל מי שהקול המילולי שלו נחלש. לראות בהתנהגות ובשתיקה סימן ולא הפרעה הוא תנאי לזיהוי מוקדם של פגיעה (רודריגז ברנע, 2025).</w:t>
+      </w:r>
+    </w:p>
+    <w:p>
+      <w:pPr>
+        <w:bidi w:val="1"/>
+        <w:spacing w:line="360" w:lineRule="auto" w:after="160"/>
+        <w:jc w:val="both"/>
+      </w:pPr>
+      <w:r>
+        <w:rPr>
+          <w:rFonts w:ascii="David" w:hAnsi="David" w:cs="David"/>
+          <w:b w:val="0"/>
+          <w:i w:val="0"/>
+          <w:sz w:val="24"/>
+          <w:szCs w:val="24"/>
+          <w:rtl w:val="1"/>
+        </w:rPr>
         <w:t>המסקנה שאני לוקחת היא שהגנה על נשים ונערות עם מוגבלות לא יכולה להסתכם בשמירה מבחוץ. שמירה לבדה משאירה אותן תלויות, ולעיתים תלויות דווקא במי שעלול לפגוע. מה שהקורס קרא לו שינוי פרדיגמה ליישום רגיש מגדר מקבל כאן תוכן ממשי, לחזק את הקול, את הידע ואת מעגלי התמיכה של האישה עצמה, כך שהיא לא רק מוגנת אלא גם מסוגלת להגן על עצמה. זו בעיניי החוליה שחסרה כשמדברים רק על מוגנות, והיא גם החוליה שהופכת את ההגנה למכבדת ולא למשתיקה.</w:t>
       </w:r>
     </w:p>
@@ -481,6 +517,136 @@
         </w:rPr>
         <w:t>רשימת מקורות</w:t>
       </w:r>
+    </w:p>
+    <w:p>
+      <w:pPr>
+        <w:bidi w:val="1"/>
+        <w:spacing w:line="360" w:lineRule="auto" w:after="200"/>
+        <w:ind w:left="720" w:hanging="720"/>
+        <w:jc w:val="both"/>
+      </w:pPr>
+      <w:r>
+        <w:rPr>
+          <w:rFonts w:ascii="David" w:hAnsi="David" w:cs="David"/>
+          <w:b w:val="0"/>
+          <w:i w:val="0"/>
+          <w:sz w:val="24"/>
+          <w:szCs w:val="24"/>
+          <w:rtl w:val="1"/>
+        </w:rPr>
+        <w:t xml:space="preserve">הולר, ר', וורנר, ש' (2025). תפיסות ושיקולים של עובדות סוציאליות בתהליכי מינוי של אפוטרופסות וקבלת החלטות נתמכת בקרב אנשים עם מוגבלויות: המלצות להכשרה ולמדיניות. </w:t>
+      </w:r>
+      <w:r>
+        <w:rPr>
+          <w:rFonts w:ascii="David" w:hAnsi="David" w:cs="David"/>
+          <w:b w:val="0"/>
+          <w:i/>
+          <w:sz w:val="24"/>
+          <w:szCs w:val="24"/>
+          <w:rtl w:val="1"/>
+        </w:rPr>
+        <w:t>ביטחון סוציאלי, 124</w:t>
+      </w:r>
+      <w:r>
+        <w:rPr>
+          <w:rFonts w:ascii="David" w:hAnsi="David" w:cs="David"/>
+          <w:b w:val="0"/>
+          <w:i w:val="0"/>
+          <w:sz w:val="24"/>
+          <w:szCs w:val="24"/>
+          <w:rtl w:val="1"/>
+        </w:rPr>
+        <w:t>, 75-104.</w:t>
+      </w:r>
+      <w:r>
+        <w:rPr>
+          <w:rFonts w:ascii="David" w:hAnsi="David" w:cs="David"/>
+          <w:b w:val="0"/>
+          <w:i w:val="0"/>
+          <w:sz w:val="24"/>
+          <w:szCs w:val="24"/>
+          <w:rtl w:val="1"/>
+        </w:rPr>
+        <w:t xml:space="preserve"> </w:t>
+      </w:r>
+      <w:hyperlink r:id="rId9">
+        <w:r>
+          <w:rPr>
+            <w:rFonts w:ascii="David" w:hAnsi="David" w:cs="David"/>
+            <w:sz w:val="24"/>
+            <w:szCs w:val="24"/>
+            <w:color w:val="0563C1"/>
+            <w:u w:val="single"/>
+            <w:rtl w:val="1"/>
+          </w:rPr>
+          <w:t xml:space="preserve">https://www.btl.gov.il/Publications/Social_Security/124/Documents/holer30.pdf</w:t>
+        </w:r>
+      </w:hyperlink>
+    </w:p>
+    <w:p>
+      <w:pPr>
+        <w:bidi w:val="1"/>
+        <w:spacing w:line="360" w:lineRule="auto" w:after="200"/>
+        <w:ind w:left="720" w:hanging="720"/>
+        <w:jc w:val="both"/>
+      </w:pPr>
+      <w:r>
+        <w:rPr>
+          <w:rFonts w:ascii="David" w:hAnsi="David" w:cs="David"/>
+          <w:b w:val="0"/>
+          <w:i w:val="0"/>
+          <w:sz w:val="24"/>
+          <w:szCs w:val="24"/>
+          <w:rtl w:val="1"/>
+        </w:rPr>
+        <w:t xml:space="preserve">רודריגז ברנע, ע' (2025). "התנהגות כקול": סקירת בעיות רפואיות נלוות המתבטאות בהתנהגויות מאתגרות בקרב ילדים עם אוטיזם וההתערבויות הטיפוליות. </w:t>
+      </w:r>
+      <w:r>
+        <w:rPr>
+          <w:rFonts w:ascii="David" w:hAnsi="David" w:cs="David"/>
+          <w:b w:val="0"/>
+          <w:i/>
+          <w:sz w:val="24"/>
+          <w:szCs w:val="24"/>
+          <w:rtl w:val="1"/>
+        </w:rPr>
+        <w:t>מוגבלות וחברה: מחקר ופרקטיקה, 5</w:t>
+      </w:r>
+      <w:r>
+        <w:rPr>
+          <w:rFonts w:ascii="David" w:hAnsi="David" w:cs="David"/>
+          <w:b w:val="0"/>
+          <w:i w:val="0"/>
+          <w:sz w:val="24"/>
+          <w:szCs w:val="24"/>
+          <w:rtl w:val="1"/>
+        </w:rPr>
+        <w:t>, 101-132.</w:t>
+      </w:r>
+      <w:r>
+        <w:rPr>
+          <w:rFonts w:ascii="David" w:hAnsi="David" w:cs="David"/>
+          <w:b w:val="0"/>
+          <w:i w:val="0"/>
+          <w:sz w:val="24"/>
+          <w:szCs w:val="24"/>
+          <w:rtl w:val="1"/>
+        </w:rPr>
+        <w:t xml:space="preserve"> </w:t>
+      </w:r>
+      <w:hyperlink r:id="rId10">
+        <w:r>
+          <w:rPr>
+            <w:rFonts w:ascii="David" w:hAnsi="David" w:cs="David"/>
+            <w:sz w:val="24"/>
+            <w:szCs w:val="24"/>
+            <w:color w:val="0563C1"/>
+            <w:u w:val="single"/>
+            <w:rtl w:val="1"/>
+          </w:rPr>
+          <w:t xml:space="preserve">https://kb.beitissie.org.il/digital/%D7%9E%D7%95%D7%92%D7%91%D7%9C%D7%95%D7%AA-%D7%95%D7%97%D7%91%D7%A8%D7%94_%D7%9E%D7%94%D7%93%D7%95%D7%A8%D7%94-%D7%93%D7%99%D7%92%D7%99%D7%98%D7%9C%D7%99%D7%AA_%D7%92%D7%99%D7%9C%D7%99%D7%95%D7%9F-5/</w:t>
+        </w:r>
+      </w:hyperlink>
     </w:p>
     <w:p>
       <w:pPr>
@@ -533,7 +699,7 @@
         </w:rPr>
         <w:t xml:space="preserve"> </w:t>
       </w:r>
-      <w:hyperlink r:id="rId9">
+      <w:hyperlink r:id="rId11">
         <w:r>
           <w:rPr>
             <w:rFonts w:ascii="David" w:hAnsi="David" w:cs="David"/>
@@ -598,7 +764,7 @@
         </w:rPr>
         <w:t xml:space="preserve"> </w:t>
       </w:r>
-      <w:hyperlink r:id="rId10">
+      <w:hyperlink r:id="rId12">
         <w:r>
           <w:rPr>
             <w:rFonts w:ascii="David" w:hAnsi="David" w:cs="David"/>
@@ -663,7 +829,7 @@
         </w:rPr>
         <w:t xml:space="preserve"> </w:t>
       </w:r>
-      <w:hyperlink r:id="rId11">
+      <w:hyperlink r:id="rId13">
         <w:r>
           <w:rPr>
             <w:rFonts w:ascii="David" w:hAnsi="David" w:cs="David"/>

</xml_diff>

<commit_message>
Fill Hadir's name and ID on title page (Hadir Abd Alhadi, 322580564)
Co-Authored-By: Claude <noreply@anthropic.com>
</commit_message>
<xml_diff>
--- a/מוגבלות_וסיכון_רפלקציה_הדיר.docx
+++ b/מוגבלות_וסיכון_רפלקציה_הדיר.docx
@@ -140,7 +140,7 @@
           <w:szCs w:val="26"/>
           <w:rtl w:val="1"/>
         </w:rPr>
-        <w:t>מגישה: הדיר ___________________</w:t>
+        <w:t>מגישה: הדיר עבד אלהאדי</w:t>
       </w:r>
     </w:p>
     <w:p>
@@ -158,7 +158,7 @@
           <w:szCs w:val="26"/>
           <w:rtl w:val="1"/>
         </w:rPr>
-        <w:t>ת.ז: ___________________</w:t>
+        <w:t>ת.ז: 322580564</w:t>
       </w:r>
     </w:p>
     <w:p>

</xml_diff>

<commit_message>
Add Ono Academic College logo to title pages
Co-Authored-By: Claude <noreply@anthropic.com>
</commit_message>
<xml_diff>
--- a/מוגבלות_וסיכון_רפלקציה_הדיר.docx
+++ b/מוגבלות_וסיכון_רפלקציה_הדיר.docx
@@ -21,36 +21,42 @@
     </w:p>
     <w:p>
       <w:pPr>
-        <w:bidi w:val="1"/>
-        <w:spacing w:line="360" w:lineRule="auto" w:after="0"/>
+        <w:spacing w:after="200"/>
         <w:jc w:val="center"/>
       </w:pPr>
       <w:r>
-        <w:rPr>
-          <w:rFonts w:ascii="David" w:hAnsi="David" w:cs="David"/>
-          <w:b w:val="0"/>
-          <w:i w:val="0"/>
-          <w:sz w:val="24"/>
-          <w:szCs w:val="24"/>
-          <w:rtl w:val="1"/>
-        </w:rPr>
-      </w:r>
-    </w:p>
-    <w:p>
-      <w:pPr>
-        <w:bidi w:val="1"/>
-        <w:spacing w:line="360" w:lineRule="auto" w:after="0"/>
-        <w:jc w:val="center"/>
-      </w:pPr>
-      <w:r>
-        <w:rPr>
-          <w:rFonts w:ascii="David" w:hAnsi="David" w:cs="David"/>
-          <w:b w:val="0"/>
-          <w:i w:val="0"/>
-          <w:sz w:val="24"/>
-          <w:szCs w:val="24"/>
-          <w:rtl w:val="1"/>
-        </w:rPr>
+        <w:drawing>
+          <wp:inline xmlns:a="http://schemas.openxmlformats.org/drawingml/2006/main" xmlns:pic="http://schemas.openxmlformats.org/drawingml/2006/picture">
+            <wp:extent cx="1554480" cy="1554480"/>
+            <wp:docPr id="1" name="Picture 1"/>
+            <wp:cNvGraphicFramePr>
+              <a:graphicFrameLocks noChangeAspect="1"/>
+            </wp:cNvGraphicFramePr>
+            <a:graphic>
+              <a:graphicData uri="http://schemas.openxmlformats.org/drawingml/2006/picture">
+                <pic:pic>
+                  <pic:nvPicPr>
+                    <pic:cNvPr id="0" name="4ea60982-IMG_7642.jpeg"/>
+                    <pic:cNvPicPr/>
+                  </pic:nvPicPr>
+                  <pic:blipFill>
+                    <a:blip r:embed="rId9"/>
+                    <a:stretch>
+                      <a:fillRect/>
+                    </a:stretch>
+                  </pic:blipFill>
+                  <pic:spPr>
+                    <a:xfrm>
+                      <a:off x="0" y="0"/>
+                      <a:ext cx="1554480" cy="1554480"/>
+                    </a:xfrm>
+                    <a:prstGeom prst="rect"/>
+                  </pic:spPr>
+                </pic:pic>
+              </a:graphicData>
+            </a:graphic>
+          </wp:inline>
+        </w:drawing>
       </w:r>
     </w:p>
     <w:p>
@@ -569,7 +575,7 @@
         </w:rPr>
         <w:t xml:space="preserve"> </w:t>
       </w:r>
-      <w:hyperlink r:id="rId9">
+      <w:hyperlink r:id="rId10">
         <w:r>
           <w:rPr>
             <w:rFonts w:ascii="David" w:hAnsi="David" w:cs="David"/>
@@ -634,7 +640,7 @@
         </w:rPr>
         <w:t xml:space="preserve"> </w:t>
       </w:r>
-      <w:hyperlink r:id="rId10">
+      <w:hyperlink r:id="rId11">
         <w:r>
           <w:rPr>
             <w:rFonts w:ascii="David" w:hAnsi="David" w:cs="David"/>
@@ -699,7 +705,7 @@
         </w:rPr>
         <w:t xml:space="preserve"> </w:t>
       </w:r>
-      <w:hyperlink r:id="rId11">
+      <w:hyperlink r:id="rId12">
         <w:r>
           <w:rPr>
             <w:rFonts w:ascii="David" w:hAnsi="David" w:cs="David"/>
@@ -764,7 +770,7 @@
         </w:rPr>
         <w:t xml:space="preserve"> </w:t>
       </w:r>
-      <w:hyperlink r:id="rId12">
+      <w:hyperlink r:id="rId13">
         <w:r>
           <w:rPr>
             <w:rFonts w:ascii="David" w:hAnsi="David" w:cs="David"/>
@@ -829,7 +835,7 @@
         </w:rPr>
         <w:t xml:space="preserve"> </w:t>
       </w:r>
-      <w:hyperlink r:id="rId13">
+      <w:hyperlink r:id="rId14">
         <w:r>
           <w:rPr>
             <w:rFonts w:ascii="David" w:hAnsi="David" w:cs="David"/>

</xml_diff>

<commit_message>
Add missing middle section (part bet: key insights) and expand individual works to three sections
Co-Authored-By: Claude <noreply@anthropic.com>
</commit_message>
<xml_diff>
--- a/מוגבלות_וסיכון_רפלקציה_הדיר.docx
+++ b/מוגבלות_וסיכון_רפלקציה_הדיר.docx
@@ -318,7 +318,102 @@
           <w:szCs w:val="28"/>
           <w:rtl w:val="1"/>
         </w:rPr>
-        <w:t>חלק ב: העמקה בנושא מרכזי מהקורס</w:t>
+        <w:t>חלק ב: תובנות מרכזיות מהקורס</w:t>
+      </w:r>
+    </w:p>
+    <w:p>
+      <w:pPr>
+        <w:bidi w:val="1"/>
+        <w:spacing w:line="360" w:lineRule="auto" w:after="160"/>
+        <w:jc w:val="both"/>
+      </w:pPr>
+      <w:r>
+        <w:rPr>
+          <w:rFonts w:ascii="David" w:hAnsi="David" w:cs="David"/>
+          <w:b w:val="0"/>
+          <w:i w:val="0"/>
+          <w:sz w:val="24"/>
+          <w:szCs w:val="24"/>
+          <w:rtl w:val="1"/>
+        </w:rPr>
+        <w:t>התובנה המרכזית שאני יוצאת איתה היא שמגדר ומוגבלות אינם שני מצבים נפרדים שמתחברים במקרה, אלא הצטלבות שמייצרת פגיעוּת חדשה. אישה עם מוגבלות אינה חווה קצת מזה וקצת מזה, היא נמצאת בנקודה שבה שתי מערכות של אפליה נפגשות ומגבירות זו את זו. הבנתי שכדי לראות אותה באמת אני צריכה להחזיק את שני הצירים בו-זמנית, ולא לבחור אחד מהם.</w:t>
+      </w:r>
+    </w:p>
+    <w:p>
+      <w:pPr>
+        <w:bidi w:val="1"/>
+        <w:spacing w:line="360" w:lineRule="auto" w:after="160"/>
+        <w:jc w:val="both"/>
+      </w:pPr>
+      <w:r>
+        <w:rPr>
+          <w:rFonts w:ascii="David" w:hAnsi="David" w:cs="David"/>
+          <w:b w:val="0"/>
+          <w:i w:val="0"/>
+          <w:sz w:val="24"/>
+          <w:szCs w:val="24"/>
+          <w:rtl w:val="1"/>
+        </w:rPr>
+        <w:t>תובנה שנייה נוגעת למנגנון. הסיכון של נשים עם מוגבלות נשען כמעט תמיד על תלות. כשמי שאמור לתמוך הוא גם מי שיכול לפגוע, כל דיווח הופך לסיכון קיומי, ולכן השתיקה איננה בחירה אלא מלכוד. זו הייתה עבורי ההבנה שהכי שינתה את הדרך שבה אני מפרשת חוסר תלונה. שתיקה כבר לא אומרת לי שהכול בסדר.</w:t>
+      </w:r>
+    </w:p>
+    <w:p>
+      <w:pPr>
+        <w:bidi w:val="1"/>
+        <w:spacing w:line="360" w:lineRule="auto" w:after="160"/>
+        <w:jc w:val="both"/>
+      </w:pPr>
+      <w:r>
+        <w:rPr>
+          <w:rFonts w:ascii="David" w:hAnsi="David" w:cs="David"/>
+          <w:b w:val="0"/>
+          <w:i w:val="0"/>
+          <w:sz w:val="24"/>
+          <w:szCs w:val="24"/>
+          <w:rtl w:val="1"/>
+        </w:rPr>
+        <w:t>תובנה שלישית היא עד כמה הפגיעוּת הזאת שקופה למערכת. נשים וצעירות עם מוגבלות כמעט לא מיוצגות במחקר, בסטטיסטיקה ובמדיניות, וכשמישהי לא נספרת קשה מאוד להגן עליה. למדתי שהיעדר הנתונים איננו פרט טכני אלא חלק מהבעיה עצמה, כי הוא משכפל את חוסר הראות שמסכן אותן מלכתחילה.</w:t>
+      </w:r>
+    </w:p>
+    <w:p>
+      <w:pPr>
+        <w:bidi w:val="1"/>
+        <w:spacing w:line="360" w:lineRule="auto" w:after="160"/>
+        <w:jc w:val="both"/>
+      </w:pPr>
+      <w:r>
+        <w:rPr>
+          <w:rFonts w:ascii="David" w:hAnsi="David" w:cs="David"/>
+          <w:b w:val="0"/>
+          <w:i w:val="0"/>
+          <w:sz w:val="24"/>
+          <w:szCs w:val="24"/>
+          <w:rtl w:val="1"/>
+        </w:rPr>
+        <w:t>התובנה האחרונה היא שהמענה חייב לעבור שינוי פרדיגמה. הגנה שמסתכמת בשמירה מבחוץ משאירה את האישה תלויה וחסרת קול, ולכן איננה מספיקה. מה שהקורס קרא לו יישום רגיש מגדר פירושו בשבילי לחזק את הידע, את הקול ואת מעגלי התמיכה של האישה עצמה, כך שהיא לא רק מוגנת אלא גם שותפה פעילה בהגנה על עצמה.</w:t>
+      </w:r>
+    </w:p>
+    <w:p>
+      <w:r>
+        <w:br w:type="page"/>
+      </w:r>
+    </w:p>
+    <w:p>
+      <w:pPr>
+        <w:bidi w:val="1"/>
+        <w:spacing w:line="360" w:lineRule="auto" w:after="200"/>
+        <w:jc w:val="right"/>
+      </w:pPr>
+      <w:r>
+        <w:rPr>
+          <w:rFonts w:ascii="David" w:hAnsi="David" w:cs="David"/>
+          <w:b/>
+          <w:i w:val="0"/>
+          <w:sz w:val="28"/>
+          <w:szCs w:val="28"/>
+          <w:rtl w:val="1"/>
+        </w:rPr>
+        <w:t>חלק ג: העמקה בנושא מרכזי מהקורס</w:t>
       </w:r>
     </w:p>
     <w:p>

</xml_diff>

<commit_message>
Align part bet to assignment: shared insights (same in both individual works and pair)
Co-Authored-By: Claude <noreply@anthropic.com>
</commit_message>
<xml_diff>
--- a/מוגבלות_וסיכון_רפלקציה_הדיר.docx
+++ b/מוגבלות_וסיכון_רפלקציה_הדיר.docx
@@ -318,7 +318,7 @@
           <w:szCs w:val="28"/>
           <w:rtl w:val="1"/>
         </w:rPr>
-        <w:t>חלק ב: תובנות מרכזיות מהקורס</w:t>
+        <w:t>חלק ב: תובנות משותפות</w:t>
       </w:r>
     </w:p>
     <w:p>
@@ -336,7 +336,7 @@
           <w:szCs w:val="24"/>
           <w:rtl w:val="1"/>
         </w:rPr>
-        <w:t>התובנה המרכזית שאני יוצאת איתה היא שמגדר ומוגבלות אינם שני מצבים נפרדים שמתחברים במקרה, אלא הצטלבות שמייצרת פגיעוּת חדשה. אישה עם מוגבלות אינה חווה קצת מזה וקצת מזה, היא נמצאת בנקודה שבה שתי מערכות של אפליה נפגשות ומגבירות זו את זו. הבנתי שכדי לראות אותה באמת אני צריכה להחזיק את שני הצירים בו-זמנית, ולא לבחור אחד מהם.</w:t>
+        <w:t>התובנה הראשונה שאנחנו לוקחות מהקורס ביחד היא ששתינו נכנסנו אליו עם אותה הנחה, שהגנה היא כל התפקיד, ושתפקידנו מול אדם עם מוגבלות הוא בעיקר לשמור עליו מפני העולם. הקורס פירק לנו את ההנחה הזאת. למדנו שהסיכון כמעט אף פעם לא נולד בתוך האדם, אלא נוצר במפגש בינו לבין סביבה שאינה מותאמת, ובתלות שלו באנשים שאמורים לתמוך בו. זו נקודה שהגענו אליה משתי דרכים שונות והיא חיברה בינינו.</w:t>
       </w:r>
     </w:p>
     <w:p>
@@ -354,7 +354,7 @@
           <w:szCs w:val="24"/>
           <w:rtl w:val="1"/>
         </w:rPr>
-        <w:t>תובנה שנייה נוגעת למנגנון. הסיכון של נשים עם מוגבלות נשען כמעט תמיד על תלות. כשמי שאמור לתמוך הוא גם מי שיכול לפגוע, כל דיווח הופך לסיכון קיומי, ולכן השתיקה איננה בחירה אלא מלכוד. זו הייתה עבורי ההבנה שהכי שינתה את הדרך שבה אני מפרשת חוסר תלונה. שתיקה כבר לא אומרת לי שהכול בסדר.</w:t>
+        <w:t>העבודה המשותפת על המצגת "זה הילד שלי" ועל פרשת מעון בני ציון הפכה את זה למוחשי. כל אחת מאיתנו הסתכלה מזווית אחרת, מרים דרך המתח בין מוגנות לאוטונומיה והדיר דרך הפגיעוּת המגדרית ושתיקת הקורבן ה"שקוף", והגענו לאותה מסקנה. המסגרת שהייתה אמורה להגן הפכה בעצמה למקום של פגיעה, בין השאר משום שלא היו בה עיניים מבחוץ ולא היה קול לדיירים. גילינו שדווקא ההגנה הסגורה, זו שאין בה בחירה ואין בה שקיפות, היא שאפשרה את הפגיעה.</w:t>
       </w:r>
     </w:p>
     <w:p>
@@ -372,7 +372,7 @@
           <w:szCs w:val="24"/>
           <w:rtl w:val="1"/>
         </w:rPr>
-        <w:t>תובנה שלישית היא עד כמה הפגיעוּת הזאת שקופה למערכת. נשים וצעירות עם מוגבלות כמעט לא מיוצגות במחקר, בסטטיסטיקה ובמדיניות, וכשמישהי לא נספרת קשה מאוד להגן עליה. למדתי שהיעדר הנתונים איננו פרט טכני אלא חלק מהבעיה עצמה, כי הוא משכפל את חוסר הראות שמסכן אותן מלכתחילה.</w:t>
+        <w:t>שתינו יצאנו עם חשד בריא כלפי התשובה הקלה. הגנה שמשתיקה את מי שהיא אמורה לשמור עליו הופכת בעצמה לסיכון, וזה נכון גם לאדם עם אוטיזם שמחליטים במקומו וגם לאישה עם מוגבלות שלא מאמינים לה כשהיא מספרת. השאלה המשותפת שאנחנו לוקחות איתנו איננה עוד איך אנחנו שומרות על האדם, אלא איך אנחנו עוזרות לו לשמור על עצמו, איך אנחנו מכניסות ידע, קול ובחירה בדיוק למקומות שבהם הכי קל להיעלם.</w:t>
       </w:r>
     </w:p>
     <w:p>
@@ -390,7 +390,7 @@
           <w:szCs w:val="24"/>
           <w:rtl w:val="1"/>
         </w:rPr>
-        <w:t>התובנה האחרונה היא שהמענה חייב לעבור שינוי פרדיגמה. הגנה שמסתכמת בשמירה מבחוץ משאירה את האישה תלויה וחסרת קול, ולכן איננה מספיקה. מה שהקורס קרא לו יישום רגיש מגדר פירושו בשבילי לחזק את הידע, את הקול ואת מעגלי התמיכה של האישה עצמה, כך שהיא לא רק מוגנת אלא גם שותפה פעילה בהגנה על עצמה.</w:t>
+        <w:t>מעבר לתוכן, המסע המשותף לימד אותנו גם משהו על עצם העבודה בזוג. שתי נקודות מבט על אותו מקרה נתנו לנו תמונה שאף אחת מאיתנו לא הייתה מגיעה אליה לבד. אנחנו מסיימות את הקורס עם פחות ביטחון בתשובות מוחלטות, עם יותר שאלות פתוחות, ועם החלטה לשים לב דווקא למי שקל לפספס.</w:t>
       </w:r>
     </w:p>
     <w:p>

</xml_diff>

<commit_message>
Reword shared-insights (part bet) distinctly per student so individual submissions aren't identical
Co-Authored-By: Claude <noreply@anthropic.com>
</commit_message>
<xml_diff>
--- a/מוגבלות_וסיכון_רפלקציה_הדיר.docx
+++ b/מוגבלות_וסיכון_רפלקציה_הדיר.docx
@@ -336,7 +336,7 @@
           <w:szCs w:val="24"/>
           <w:rtl w:val="1"/>
         </w:rPr>
-        <w:t>התובנה הראשונה שאנחנו לוקחות מהקורס ביחד היא ששתינו נכנסנו אליו עם אותה הנחה, שהגנה היא כל התפקיד, ושתפקידנו מול אדם עם מוגבלות הוא בעיקר לשמור עליו מפני העולם. הקורס פירק לנו את ההנחה הזאת. למדנו שהסיכון כמעט אף פעם לא נולד בתוך האדם, אלא נוצר במפגש בינו לבין סביבה שאינה מותאמת, ובתלות שלו באנשים שאמורים לתמוך בו. זו נקודה שהגענו אליה משתי דרכים שונות והיא חיברה בינינו.</w:t>
+        <w:t>אם אנחנו מנסות לזקק מה למדנו יחד, הדבר הראשון הוא ששתינו הגענו לקורס עם אותה הנחה מוטעית, שכל תפקידנו הוא לשמור. במהלך המפגשים הבנו ששמירה לבדה מפספסת את העיקר, משום שהסיכון איננו תכונה של האדם עם המוגבלות אלא תוצר של סביבה לא מותאמת ושל תלות. את המסקנה הזאת גיבשנו כל אחת מכיוון אחר, וזה מה שהפך אותה לחזקה יותר.</w:t>
       </w:r>
     </w:p>
     <w:p>
@@ -354,7 +354,7 @@
           <w:szCs w:val="24"/>
           <w:rtl w:val="1"/>
         </w:rPr>
-        <w:t>העבודה המשותפת על המצגת "זה הילד שלי" ועל פרשת מעון בני ציון הפכה את זה למוחשי. כל אחת מאיתנו הסתכלה מזווית אחרת, מרים דרך המתח בין מוגנות לאוטונומיה והדיר דרך הפגיעוּת המגדרית ושתיקת הקורבן ה"שקוף", והגענו לאותה מסקנה. המסגרת שהייתה אמורה להגן הפכה בעצמה למקום של פגיעה, בין השאר משום שלא היו בה עיניים מבחוץ ולא היה קול לדיירים. גילינו שדווקא ההגנה הסגורה, זו שאין בה בחירה ואין בה שקיפות, היא שאפשרה את הפגיעה.</w:t>
+        <w:t>העבודה המשותפת שלנו על "זה הילד שלי" ועל מעון בני ציון המחישה זאת היטב. מרים בחנה את המקרה דרך המתח בין הגנה לאוטונומיה, ואני דרך הזווית המגדרית והשתיקה של הקורבן ה"שקוף", אבל הגענו לאותה הבנה. דווקא המסגרת הסגורה, זו שאין בה בחירה ואין בה מבט מבחוץ, היא שאפשרה את הפגיעה להימשך לאורך זמן.</w:t>
       </w:r>
     </w:p>
     <w:p>
@@ -372,7 +372,7 @@
           <w:szCs w:val="24"/>
           <w:rtl w:val="1"/>
         </w:rPr>
-        <w:t>שתינו יצאנו עם חשד בריא כלפי התשובה הקלה. הגנה שמשתיקה את מי שהיא אמורה לשמור עליו הופכת בעצמה לסיכון, וזה נכון גם לאדם עם אוטיזם שמחליטים במקומו וגם לאישה עם מוגבלות שלא מאמינים לה כשהיא מספרת. השאלה המשותפת שאנחנו לוקחות איתנו איננה עוד איך אנחנו שומרות על האדם, אלא איך אנחנו עוזרות לו לשמור על עצמו, איך אנחנו מכניסות ידע, קול ובחירה בדיוק למקומות שבהם הכי קל להיעלם.</w:t>
+        <w:t>מכאן נגזרת תובנה שאנחנו לוקחות איתנו, שאסור להסתפק בתשובה הנוחה. הגנה שמשתיקה קול הופכת למקור סיכון בפני עצמה, בין שמדובר באדם על הרצף ובין שמדובר בנערה שלא מקשיבים לה. השאלה שאנחנו שואלות עכשיו איננה כיצד לשמור על האדם, אלא כיצד לצייד אותו בכלים לשמור על עצמו.</w:t>
       </w:r>
     </w:p>
     <w:p>
@@ -390,7 +390,7 @@
           <w:szCs w:val="24"/>
           <w:rtl w:val="1"/>
         </w:rPr>
-        <w:t>מעבר לתוכן, המסע המשותף לימד אותנו גם משהו על עצם העבודה בזוג. שתי נקודות מבט על אותו מקרה נתנו לנו תמונה שאף אחת מאיתנו לא הייתה מגיעה אליה לבד. אנחנו מסיימות את הקורס עם פחות ביטחון בתשובות מוחלטות, עם יותר שאלות פתוחות, ועם החלטה לשים לב דווקא למי שקל לפספס.</w:t>
+        <w:t>בסופו של דבר, גם הדרך שבה עבדנו לימדה אותנו. חיבור של שתי נקודות מבט הראה לנו את מה שכל אחת לבדה הייתה מחמיצה. אנחנו מסיימות את הקורס עם יותר ספקות מתשובות, ועם מחויבות משותפת לתת תשומת לב דווקא למי שהמערכת נוטה לא לראות.</w:t>
       </w:r>
     </w:p>
     <w:p>

</xml_diff>